<commit_message>
Blockchain course plan: 60 hours (15 weeks x 4 hours)
Co-Authored-By: Claude Opus 5.5 <noreply@anthropic.com>
Claude-Session: https://claude.ai/code/session_01Hy1NCTkkcfUJLKZg2hmDiP
</commit_message>
<xml_diff>
--- a/Blockchain/Course_Plan_Blockchain_Technology.docx
+++ b/Blockchain/Course_Plan_Blockchain_Technology.docx
@@ -177,7 +177,7 @@
           <w:b w:val="0"/>
           <w:sz w:val="19"/>
         </w:rPr>
-        <w:t>45 (15 weeks × 3 hours)</w:t>
+        <w:t>60 (15 weeks × 4 hours)</w:t>
       </w:r>
     </w:p>
     <w:p>
@@ -283,7 +283,7 @@
           <w:sz w:val="23"/>
           <w:u w:val="none"/>
         </w:rPr>
-        <w:t>UNIT I: Block Chain and its History — 8 Hours</w:t>
+        <w:t>UNIT I: Block Chain and its History — 10 Hours</w:t>
       </w:r>
     </w:p>
     <w:tbl>
@@ -639,7 +639,104 @@
                 <w:b w:val="0"/>
                 <w:sz w:val="18"/>
               </w:rPr>
-              <w:t>Blockchain Components – blocks, transactions, nodes, ledger, hashing and digital signatures</w:t>
+              <w:t>Blockchain Components – blocks, transactions, nodes, peer-to-peer network, ledger</w:t>
+            </w:r>
+          </w:p>
+        </w:tc>
+        <w:tc>
+          <w:tcPr>
+            <w:tcW w:type="dxa" w:w="624"/>
+            <w:vAlign w:val="center"/>
+          </w:tcPr>
+          <w:p>
+            <w:pPr>
+              <w:keepNext w:val="0"/>
+              <w:jc w:val="center"/>
+            </w:pPr>
+            <w:r>
+              <w:rPr>
+                <w:b w:val="0"/>
+                <w:sz w:val="18"/>
+              </w:rPr>
+              <w:t>1</w:t>
+            </w:r>
+          </w:p>
+        </w:tc>
+        <w:tc>
+          <w:tcPr>
+            <w:tcW w:type="dxa" w:w="1984"/>
+            <w:vAlign w:val="center"/>
+          </w:tcPr>
+          <w:p>
+            <w:pPr>
+              <w:keepNext w:val="0"/>
+            </w:pPr>
+            <w:r>
+              <w:rPr>
+                <w:b w:val="0"/>
+                <w:sz w:val="18"/>
+              </w:rPr>
+              <w:t>Lecture / Board</w:t>
+            </w:r>
+          </w:p>
+        </w:tc>
+        <w:tc>
+          <w:tcPr>
+            <w:tcW w:type="dxa" w:w="3118"/>
+            <w:vAlign w:val="center"/>
+          </w:tcPr>
+          <w:p>
+            <w:pPr>
+              <w:keepNext w:val="0"/>
+            </w:pPr>
+            <w:r>
+              <w:rPr>
+                <w:b w:val="0"/>
+                <w:sz w:val="18"/>
+              </w:rPr>
+              <w:t>Label the components of a blockchain network</w:t>
+            </w:r>
+          </w:p>
+        </w:tc>
+      </w:tr>
+      <w:tr>
+        <w:trPr>
+          <w:cantSplit w:val="true"/>
+        </w:trPr>
+        <w:tc>
+          <w:tcPr>
+            <w:tcW w:type="dxa" w:w="680"/>
+            <w:vAlign w:val="center"/>
+          </w:tcPr>
+          <w:p>
+            <w:pPr>
+              <w:keepNext w:val="0"/>
+              <w:jc w:val="center"/>
+            </w:pPr>
+            <w:r>
+              <w:rPr>
+                <w:b w:val="0"/>
+                <w:sz w:val="18"/>
+              </w:rPr>
+              <w:t>4</w:t>
+            </w:r>
+          </w:p>
+        </w:tc>
+        <w:tc>
+          <w:tcPr>
+            <w:tcW w:type="dxa" w:w="4139"/>
+            <w:vAlign w:val="center"/>
+          </w:tcPr>
+          <w:p>
+            <w:pPr>
+              <w:keepNext w:val="0"/>
+            </w:pPr>
+            <w:r>
+              <w:rPr>
+                <w:b w:val="0"/>
+                <w:sz w:val="18"/>
+              </w:rPr>
+              <w:t>Cryptographic primitives – hash functions, public-key cryptography, digital signatures</w:t>
             </w:r>
           </w:p>
         </w:tc>
@@ -694,7 +791,7 @@
                 <w:b w:val="0"/>
                 <w:sz w:val="18"/>
               </w:rPr>
-              <w:t>Compute SHA-256 hashes; observe the avalanche effect</w:t>
+              <w:t>Compute SHA-256 hashes; sign and verify a message</w:t>
             </w:r>
           </w:p>
         </w:tc>
@@ -718,7 +815,7 @@
                 <w:b w:val="0"/>
                 <w:sz w:val="18"/>
               </w:rPr>
-              <w:t>4</w:t>
+              <w:t>5</w:t>
             </w:r>
           </w:p>
         </w:tc>
@@ -755,7 +852,7 @@
                 <w:b w:val="0"/>
                 <w:sz w:val="18"/>
               </w:rPr>
-              <w:t>1</w:t>
+              <w:t>2</w:t>
             </w:r>
           </w:p>
         </w:tc>
@@ -815,7 +912,7 @@
                 <w:b w:val="0"/>
                 <w:sz w:val="18"/>
               </w:rPr>
-              <w:t>5</w:t>
+              <w:t>6</w:t>
             </w:r>
           </w:p>
         </w:tc>
@@ -912,7 +1009,7 @@
                 <w:b w:val="0"/>
                 <w:sz w:val="18"/>
               </w:rPr>
-              <w:t>6</w:t>
+              <w:t>7</w:t>
             </w:r>
           </w:p>
         </w:tc>
@@ -1002,7 +1099,7 @@
           <w:sz w:val="23"/>
           <w:u w:val="none"/>
         </w:rPr>
-        <w:t>UNIT II: Decentralization and Consensus Algorithms — 10 Hours</w:t>
+        <w:t>UNIT II: Decentralization and Consensus Algorithms — 13 Hours</w:t>
       </w:r>
     </w:p>
     <w:tbl>
@@ -1183,7 +1280,7 @@
                 <w:b w:val="0"/>
                 <w:sz w:val="18"/>
               </w:rPr>
-              <w:t>1</w:t>
+              <w:t>2</w:t>
             </w:r>
           </w:p>
         </w:tc>
@@ -1261,7 +1358,104 @@
                 <w:b w:val="0"/>
                 <w:sz w:val="18"/>
               </w:rPr>
-              <w:t>Routes to decentralization; Decentralized organizations – DOs, DAOs, DACs, DApps</w:t>
+              <w:t>Routes to decentralization</w:t>
+            </w:r>
+          </w:p>
+        </w:tc>
+        <w:tc>
+          <w:tcPr>
+            <w:tcW w:type="dxa" w:w="624"/>
+            <w:vAlign w:val="center"/>
+          </w:tcPr>
+          <w:p>
+            <w:pPr>
+              <w:keepNext w:val="0"/>
+              <w:jc w:val="center"/>
+            </w:pPr>
+            <w:r>
+              <w:rPr>
+                <w:b w:val="0"/>
+                <w:sz w:val="18"/>
+              </w:rPr>
+              <w:t>1</w:t>
+            </w:r>
+          </w:p>
+        </w:tc>
+        <w:tc>
+          <w:tcPr>
+            <w:tcW w:type="dxa" w:w="1984"/>
+            <w:vAlign w:val="center"/>
+          </w:tcPr>
+          <w:p>
+            <w:pPr>
+              <w:keepNext w:val="0"/>
+            </w:pPr>
+            <w:r>
+              <w:rPr>
+                <w:b w:val="0"/>
+                <w:sz w:val="18"/>
+              </w:rPr>
+              <w:t>Lecture / Discussion</w:t>
+            </w:r>
+          </w:p>
+        </w:tc>
+        <w:tc>
+          <w:tcPr>
+            <w:tcW w:type="dxa" w:w="3118"/>
+            <w:vAlign w:val="center"/>
+          </w:tcPr>
+          <w:p>
+            <w:pPr>
+              <w:keepNext w:val="0"/>
+            </w:pPr>
+            <w:r>
+              <w:rPr>
+                <w:b w:val="0"/>
+                <w:sz w:val="18"/>
+              </w:rPr>
+              <w:t>Map the steps to decentralize a given system</w:t>
+            </w:r>
+          </w:p>
+        </w:tc>
+      </w:tr>
+      <w:tr>
+        <w:trPr>
+          <w:cantSplit w:val="true"/>
+        </w:trPr>
+        <w:tc>
+          <w:tcPr>
+            <w:tcW w:type="dxa" w:w="680"/>
+            <w:vAlign w:val="center"/>
+          </w:tcPr>
+          <w:p>
+            <w:pPr>
+              <w:keepNext w:val="0"/>
+              <w:jc w:val="center"/>
+            </w:pPr>
+            <w:r>
+              <w:rPr>
+                <w:b w:val="0"/>
+                <w:sz w:val="18"/>
+              </w:rPr>
+              <w:t>3</w:t>
+            </w:r>
+          </w:p>
+        </w:tc>
+        <w:tc>
+          <w:tcPr>
+            <w:tcW w:type="dxa" w:w="4139"/>
+            <w:vAlign w:val="center"/>
+          </w:tcPr>
+          <w:p>
+            <w:pPr>
+              <w:keepNext w:val="0"/>
+            </w:pPr>
+            <w:r>
+              <w:rPr>
+                <w:b w:val="0"/>
+                <w:sz w:val="18"/>
+              </w:rPr>
+              <w:t>Decentralized organizations – DOs, DAOs, DACs, DApps</w:t>
             </w:r>
           </w:p>
         </w:tc>
@@ -1340,7 +1534,7 @@
                 <w:b w:val="0"/>
                 <w:sz w:val="18"/>
               </w:rPr>
-              <w:t>3</w:t>
+              <w:t>4</w:t>
             </w:r>
           </w:p>
         </w:tc>
@@ -1358,7 +1552,7 @@
                 <w:b w:val="0"/>
                 <w:sz w:val="18"/>
               </w:rPr>
-              <w:t>Distributed systems – CAP theorem, fault tolerance; Distributed ledger</w:t>
+              <w:t>Distributed systems – CAP theorem, fault tolerance</w:t>
             </w:r>
           </w:p>
         </w:tc>
@@ -1377,7 +1571,7 @@
                 <w:b w:val="0"/>
                 <w:sz w:val="18"/>
               </w:rPr>
-              <w:t>2</w:t>
+              <w:t>1</w:t>
             </w:r>
           </w:p>
         </w:tc>
@@ -1413,7 +1607,7 @@
                 <w:b w:val="0"/>
                 <w:sz w:val="18"/>
               </w:rPr>
-              <w:t>Compare centralized, decentralized and distributed ledgers</w:t>
+              <w:t>Apply the CAP theorem to example systems</w:t>
             </w:r>
           </w:p>
         </w:tc>
@@ -1437,7 +1631,104 @@
                 <w:b w:val="0"/>
                 <w:sz w:val="18"/>
               </w:rPr>
-              <w:t>4</w:t>
+              <w:t>5</w:t>
+            </w:r>
+          </w:p>
+        </w:tc>
+        <w:tc>
+          <w:tcPr>
+            <w:tcW w:type="dxa" w:w="4139"/>
+            <w:vAlign w:val="center"/>
+          </w:tcPr>
+          <w:p>
+            <w:pPr>
+              <w:keepNext w:val="0"/>
+            </w:pPr>
+            <w:r>
+              <w:rPr>
+                <w:b w:val="0"/>
+                <w:sz w:val="18"/>
+              </w:rPr>
+              <w:t>Distributed ledger – centralized vs. decentralized vs. distributed ledgers</w:t>
+            </w:r>
+          </w:p>
+        </w:tc>
+        <w:tc>
+          <w:tcPr>
+            <w:tcW w:type="dxa" w:w="624"/>
+            <w:vAlign w:val="center"/>
+          </w:tcPr>
+          <w:p>
+            <w:pPr>
+              <w:keepNext w:val="0"/>
+              <w:jc w:val="center"/>
+            </w:pPr>
+            <w:r>
+              <w:rPr>
+                <w:b w:val="0"/>
+                <w:sz w:val="18"/>
+              </w:rPr>
+              <w:t>1</w:t>
+            </w:r>
+          </w:p>
+        </w:tc>
+        <w:tc>
+          <w:tcPr>
+            <w:tcW w:type="dxa" w:w="1984"/>
+            <w:vAlign w:val="center"/>
+          </w:tcPr>
+          <w:p>
+            <w:pPr>
+              <w:keepNext w:val="0"/>
+            </w:pPr>
+            <w:r>
+              <w:rPr>
+                <w:b w:val="0"/>
+                <w:sz w:val="18"/>
+              </w:rPr>
+              <w:t>Lecture / Board</w:t>
+            </w:r>
+          </w:p>
+        </w:tc>
+        <w:tc>
+          <w:tcPr>
+            <w:tcW w:type="dxa" w:w="3118"/>
+            <w:vAlign w:val="center"/>
+          </w:tcPr>
+          <w:p>
+            <w:pPr>
+              <w:keepNext w:val="0"/>
+            </w:pPr>
+            <w:r>
+              <w:rPr>
+                <w:b w:val="0"/>
+                <w:sz w:val="18"/>
+              </w:rPr>
+              <w:t>Compare ledger models</w:t>
+            </w:r>
+          </w:p>
+        </w:tc>
+      </w:tr>
+      <w:tr>
+        <w:trPr>
+          <w:cantSplit w:val="true"/>
+        </w:trPr>
+        <w:tc>
+          <w:tcPr>
+            <w:tcW w:type="dxa" w:w="680"/>
+            <w:vAlign w:val="center"/>
+          </w:tcPr>
+          <w:p>
+            <w:pPr>
+              <w:keepNext w:val="0"/>
+              <w:jc w:val="center"/>
+            </w:pPr>
+            <w:r>
+              <w:rPr>
+                <w:b w:val="0"/>
+                <w:sz w:val="18"/>
+              </w:rPr>
+              <w:t>6</w:t>
             </w:r>
           </w:p>
         </w:tc>
@@ -1534,7 +1825,7 @@
                 <w:b w:val="0"/>
                 <w:sz w:val="18"/>
               </w:rPr>
-              <w:t>5</w:t>
+              <w:t>7</w:t>
             </w:r>
           </w:p>
         </w:tc>
@@ -1631,7 +1922,7 @@
                 <w:b w:val="0"/>
                 <w:sz w:val="18"/>
               </w:rPr>
-              <w:t>6</w:t>
+              <w:t>8</w:t>
             </w:r>
           </w:p>
         </w:tc>
@@ -1649,7 +1940,7 @@
                 <w:b w:val="0"/>
                 <w:sz w:val="18"/>
               </w:rPr>
-              <w:t>Consensus Algorithms: Proof of Work – mining, difficulty, energy cost</w:t>
+              <w:t>Consensus Algorithms: Proof of Work – mining, difficulty adjustment, energy cost</w:t>
             </w:r>
           </w:p>
         </w:tc>
@@ -1668,7 +1959,7 @@
                 <w:b w:val="0"/>
                 <w:sz w:val="18"/>
               </w:rPr>
-              <w:t>1</w:t>
+              <w:t>2</w:t>
             </w:r>
           </w:p>
         </w:tc>
@@ -1728,7 +2019,7 @@
                 <w:b w:val="0"/>
                 <w:sz w:val="18"/>
               </w:rPr>
-              <w:t>7</w:t>
+              <w:t>9</w:t>
             </w:r>
           </w:p>
         </w:tc>
@@ -1825,7 +2116,7 @@
                 <w:b w:val="0"/>
                 <w:sz w:val="18"/>
               </w:rPr>
-              <w:t>8</w:t>
+              <w:t>10</w:t>
             </w:r>
           </w:p>
         </w:tc>
@@ -1843,7 +2134,7 @@
                 <w:b w:val="0"/>
                 <w:sz w:val="18"/>
               </w:rPr>
-              <w:t>Proof of Elapsed Time, Proof of Activity and Proof of Concept</w:t>
+              <w:t>Proof of Elapsed Time and Proof of Activity</w:t>
             </w:r>
           </w:p>
         </w:tc>
@@ -1862,7 +2153,7 @@
                 <w:b w:val="0"/>
                 <w:sz w:val="18"/>
               </w:rPr>
-              <w:t>2</w:t>
+              <w:t>1</w:t>
             </w:r>
           </w:p>
         </w:tc>
@@ -1880,7 +2171,104 @@
                 <w:b w:val="0"/>
                 <w:sz w:val="18"/>
               </w:rPr>
-              <w:t>Lecture / Problem Solving</w:t>
+              <w:t>Lecture / Worked Examples</w:t>
+            </w:r>
+          </w:p>
+        </w:tc>
+        <w:tc>
+          <w:tcPr>
+            <w:tcW w:type="dxa" w:w="3118"/>
+            <w:vAlign w:val="center"/>
+          </w:tcPr>
+          <w:p>
+            <w:pPr>
+              <w:keepNext w:val="0"/>
+            </w:pPr>
+            <w:r>
+              <w:rPr>
+                <w:b w:val="0"/>
+                <w:sz w:val="18"/>
+              </w:rPr>
+              <w:t>Explain PoET with trusted execution environments</w:t>
+            </w:r>
+          </w:p>
+        </w:tc>
+      </w:tr>
+      <w:tr>
+        <w:trPr>
+          <w:cantSplit w:val="true"/>
+        </w:trPr>
+        <w:tc>
+          <w:tcPr>
+            <w:tcW w:type="dxa" w:w="680"/>
+            <w:vAlign w:val="center"/>
+          </w:tcPr>
+          <w:p>
+            <w:pPr>
+              <w:keepNext w:val="0"/>
+              <w:jc w:val="center"/>
+            </w:pPr>
+            <w:r>
+              <w:rPr>
+                <w:b w:val="0"/>
+                <w:sz w:val="18"/>
+              </w:rPr>
+              <w:t>11</w:t>
+            </w:r>
+          </w:p>
+        </w:tc>
+        <w:tc>
+          <w:tcPr>
+            <w:tcW w:type="dxa" w:w="4139"/>
+            <w:vAlign w:val="center"/>
+          </w:tcPr>
+          <w:p>
+            <w:pPr>
+              <w:keepNext w:val="0"/>
+            </w:pPr>
+            <w:r>
+              <w:rPr>
+                <w:b w:val="0"/>
+                <w:sz w:val="18"/>
+              </w:rPr>
+              <w:t>Proof of Concept; comparison of consensus algorithms</w:t>
+            </w:r>
+          </w:p>
+        </w:tc>
+        <w:tc>
+          <w:tcPr>
+            <w:tcW w:type="dxa" w:w="624"/>
+            <w:vAlign w:val="center"/>
+          </w:tcPr>
+          <w:p>
+            <w:pPr>
+              <w:keepNext w:val="0"/>
+              <w:jc w:val="center"/>
+            </w:pPr>
+            <w:r>
+              <w:rPr>
+                <w:b w:val="0"/>
+                <w:sz w:val="18"/>
+              </w:rPr>
+              <w:t>1</w:t>
+            </w:r>
+          </w:p>
+        </w:tc>
+        <w:tc>
+          <w:tcPr>
+            <w:tcW w:type="dxa" w:w="1984"/>
+            <w:vAlign w:val="center"/>
+          </w:tcPr>
+          <w:p>
+            <w:pPr>
+              <w:keepNext w:val="0"/>
+            </w:pPr>
+            <w:r>
+              <w:rPr>
+                <w:b w:val="0"/>
+                <w:sz w:val="18"/>
+              </w:rPr>
+              <w:t>Problem Solving / Quiz</w:t>
             </w:r>
           </w:p>
         </w:tc>
@@ -1915,7 +2303,7 @@
           <w:sz w:val="23"/>
           <w:u w:val="none"/>
         </w:rPr>
-        <w:t>UNIT III: Bitcoin and Alternative Coins — 10 Hours</w:t>
+        <w:t>UNIT III: Bitcoin and Alternative Coins — 13 Hours</w:t>
       </w:r>
     </w:p>
     <w:tbl>
@@ -2077,7 +2465,104 @@
                 <w:b w:val="0"/>
                 <w:sz w:val="18"/>
               </w:rPr>
-              <w:t>Bitcoin – overview, keys and addresses, wallets; Bitcoin transactions – inputs, outputs, UTXO</w:t>
+              <w:t>Bitcoin – overview, keys and addresses, wallets</w:t>
+            </w:r>
+          </w:p>
+        </w:tc>
+        <w:tc>
+          <w:tcPr>
+            <w:tcW w:type="dxa" w:w="624"/>
+            <w:vAlign w:val="center"/>
+          </w:tcPr>
+          <w:p>
+            <w:pPr>
+              <w:keepNext w:val="0"/>
+              <w:jc w:val="center"/>
+            </w:pPr>
+            <w:r>
+              <w:rPr>
+                <w:b w:val="0"/>
+                <w:sz w:val="18"/>
+              </w:rPr>
+              <w:t>1</w:t>
+            </w:r>
+          </w:p>
+        </w:tc>
+        <w:tc>
+          <w:tcPr>
+            <w:tcW w:type="dxa" w:w="1984"/>
+            <w:vAlign w:val="center"/>
+          </w:tcPr>
+          <w:p>
+            <w:pPr>
+              <w:keepNext w:val="0"/>
+            </w:pPr>
+            <w:r>
+              <w:rPr>
+                <w:b w:val="0"/>
+                <w:sz w:val="18"/>
+              </w:rPr>
+              <w:t>Lecture / Demonstration</w:t>
+            </w:r>
+          </w:p>
+        </w:tc>
+        <w:tc>
+          <w:tcPr>
+            <w:tcW w:type="dxa" w:w="3118"/>
+            <w:vAlign w:val="center"/>
+          </w:tcPr>
+          <w:p>
+            <w:pPr>
+              <w:keepNext w:val="0"/>
+            </w:pPr>
+            <w:r>
+              <w:rPr>
+                <w:b w:val="0"/>
+                <w:sz w:val="18"/>
+              </w:rPr>
+              <w:t>Create a test wallet and address</w:t>
+            </w:r>
+          </w:p>
+        </w:tc>
+      </w:tr>
+      <w:tr>
+        <w:trPr>
+          <w:cantSplit w:val="true"/>
+        </w:trPr>
+        <w:tc>
+          <w:tcPr>
+            <w:tcW w:type="dxa" w:w="680"/>
+            <w:vAlign w:val="center"/>
+          </w:tcPr>
+          <w:p>
+            <w:pPr>
+              <w:keepNext w:val="0"/>
+              <w:jc w:val="center"/>
+            </w:pPr>
+            <w:r>
+              <w:rPr>
+                <w:b w:val="0"/>
+                <w:sz w:val="18"/>
+              </w:rPr>
+              <w:t>2</w:t>
+            </w:r>
+          </w:p>
+        </w:tc>
+        <w:tc>
+          <w:tcPr>
+            <w:tcW w:type="dxa" w:w="4139"/>
+            <w:vAlign w:val="center"/>
+          </w:tcPr>
+          <w:p>
+            <w:pPr>
+              <w:keepNext w:val="0"/>
+            </w:pPr>
+            <w:r>
+              <w:rPr>
+                <w:b w:val="0"/>
+                <w:sz w:val="18"/>
+              </w:rPr>
+              <w:t>Bitcoin Transactions – inputs, outputs, UTXO model, transaction scripts</w:t>
             </w:r>
           </w:p>
         </w:tc>
@@ -2156,7 +2641,7 @@
                 <w:b w:val="0"/>
                 <w:sz w:val="18"/>
               </w:rPr>
-              <w:t>2</w:t>
+              <w:t>3</w:t>
             </w:r>
           </w:p>
         </w:tc>
@@ -2174,7 +2659,7 @@
                 <w:b w:val="0"/>
                 <w:sz w:val="18"/>
               </w:rPr>
-              <w:t>Bitcoin payments; Bitcoin properties; Transaction life cycle</w:t>
+              <w:t>Bitcoin payments; Bitcoin properties</w:t>
             </w:r>
           </w:p>
         </w:tc>
@@ -2229,6 +2714,103 @@
                 <w:b w:val="0"/>
                 <w:sz w:val="18"/>
               </w:rPr>
+              <w:t>List properties with supporting examples</w:t>
+            </w:r>
+          </w:p>
+        </w:tc>
+      </w:tr>
+      <w:tr>
+        <w:trPr>
+          <w:cantSplit w:val="true"/>
+        </w:trPr>
+        <w:tc>
+          <w:tcPr>
+            <w:tcW w:type="dxa" w:w="680"/>
+            <w:vAlign w:val="center"/>
+          </w:tcPr>
+          <w:p>
+            <w:pPr>
+              <w:keepNext w:val="0"/>
+              <w:jc w:val="center"/>
+            </w:pPr>
+            <w:r>
+              <w:rPr>
+                <w:b w:val="0"/>
+                <w:sz w:val="18"/>
+              </w:rPr>
+              <w:t>4</w:t>
+            </w:r>
+          </w:p>
+        </w:tc>
+        <w:tc>
+          <w:tcPr>
+            <w:tcW w:type="dxa" w:w="4139"/>
+            <w:vAlign w:val="center"/>
+          </w:tcPr>
+          <w:p>
+            <w:pPr>
+              <w:keepNext w:val="0"/>
+            </w:pPr>
+            <w:r>
+              <w:rPr>
+                <w:b w:val="0"/>
+                <w:sz w:val="18"/>
+              </w:rPr>
+              <w:t>Transaction life cycle</w:t>
+            </w:r>
+          </w:p>
+        </w:tc>
+        <w:tc>
+          <w:tcPr>
+            <w:tcW w:type="dxa" w:w="624"/>
+            <w:vAlign w:val="center"/>
+          </w:tcPr>
+          <w:p>
+            <w:pPr>
+              <w:keepNext w:val="0"/>
+              <w:jc w:val="center"/>
+            </w:pPr>
+            <w:r>
+              <w:rPr>
+                <w:b w:val="0"/>
+                <w:sz w:val="18"/>
+              </w:rPr>
+              <w:t>1</w:t>
+            </w:r>
+          </w:p>
+        </w:tc>
+        <w:tc>
+          <w:tcPr>
+            <w:tcW w:type="dxa" w:w="1984"/>
+            <w:vAlign w:val="center"/>
+          </w:tcPr>
+          <w:p>
+            <w:pPr>
+              <w:keepNext w:val="0"/>
+            </w:pPr>
+            <w:r>
+              <w:rPr>
+                <w:b w:val="0"/>
+                <w:sz w:val="18"/>
+              </w:rPr>
+              <w:t>Lecture / Worked Examples</w:t>
+            </w:r>
+          </w:p>
+        </w:tc>
+        <w:tc>
+          <w:tcPr>
+            <w:tcW w:type="dxa" w:w="3118"/>
+            <w:vAlign w:val="center"/>
+          </w:tcPr>
+          <w:p>
+            <w:pPr>
+              <w:keepNext w:val="0"/>
+            </w:pPr>
+            <w:r>
+              <w:rPr>
+                <w:b w:val="0"/>
+                <w:sz w:val="18"/>
+              </w:rPr>
               <w:t>Draw the transaction life cycle</w:t>
             </w:r>
           </w:p>
@@ -2253,7 +2835,7 @@
                 <w:b w:val="0"/>
                 <w:sz w:val="18"/>
               </w:rPr>
-              <w:t>3</w:t>
+              <w:t>5</w:t>
             </w:r>
           </w:p>
         </w:tc>
@@ -2350,7 +2932,7 @@
                 <w:b w:val="0"/>
                 <w:sz w:val="18"/>
               </w:rPr>
-              <w:t>4</w:t>
+              <w:t>6</w:t>
             </w:r>
           </w:p>
         </w:tc>
@@ -2368,7 +2950,7 @@
                 <w:b w:val="0"/>
                 <w:sz w:val="18"/>
               </w:rPr>
-              <w:t>Double spending using blockchain; Bitcoin anonymity</w:t>
+              <w:t>Double spending using blockchain</w:t>
             </w:r>
           </w:p>
         </w:tc>
@@ -2447,7 +3029,104 @@
                 <w:b w:val="0"/>
                 <w:sz w:val="18"/>
               </w:rPr>
-              <w:t>5</w:t>
+              <w:t>7</w:t>
+            </w:r>
+          </w:p>
+        </w:tc>
+        <w:tc>
+          <w:tcPr>
+            <w:tcW w:type="dxa" w:w="4139"/>
+            <w:vAlign w:val="center"/>
+          </w:tcPr>
+          <w:p>
+            <w:pPr>
+              <w:keepNext w:val="0"/>
+            </w:pPr>
+            <w:r>
+              <w:rPr>
+                <w:b w:val="0"/>
+                <w:sz w:val="18"/>
+              </w:rPr>
+              <w:t>Bitcoin anonymity – pseudonymity, mixing, de-anonymisation</w:t>
+            </w:r>
+          </w:p>
+        </w:tc>
+        <w:tc>
+          <w:tcPr>
+            <w:tcW w:type="dxa" w:w="624"/>
+            <w:vAlign w:val="center"/>
+          </w:tcPr>
+          <w:p>
+            <w:pPr>
+              <w:keepNext w:val="0"/>
+              <w:jc w:val="center"/>
+            </w:pPr>
+            <w:r>
+              <w:rPr>
+                <w:b w:val="0"/>
+                <w:sz w:val="18"/>
+              </w:rPr>
+              <w:t>1</w:t>
+            </w:r>
+          </w:p>
+        </w:tc>
+        <w:tc>
+          <w:tcPr>
+            <w:tcW w:type="dxa" w:w="1984"/>
+            <w:vAlign w:val="center"/>
+          </w:tcPr>
+          <w:p>
+            <w:pPr>
+              <w:keepNext w:val="0"/>
+            </w:pPr>
+            <w:r>
+              <w:rPr>
+                <w:b w:val="0"/>
+                <w:sz w:val="18"/>
+              </w:rPr>
+              <w:t>Lecture / Discussion</w:t>
+            </w:r>
+          </w:p>
+        </w:tc>
+        <w:tc>
+          <w:tcPr>
+            <w:tcW w:type="dxa" w:w="3118"/>
+            <w:vAlign w:val="center"/>
+          </w:tcPr>
+          <w:p>
+            <w:pPr>
+              <w:keepNext w:val="0"/>
+            </w:pPr>
+            <w:r>
+              <w:rPr>
+                <w:b w:val="0"/>
+                <w:sz w:val="18"/>
+              </w:rPr>
+              <w:t>Discuss privacy risks of public ledgers</w:t>
+            </w:r>
+          </w:p>
+        </w:tc>
+      </w:tr>
+      <w:tr>
+        <w:trPr>
+          <w:cantSplit w:val="true"/>
+        </w:trPr>
+        <w:tc>
+          <w:tcPr>
+            <w:tcW w:type="dxa" w:w="680"/>
+            <w:vAlign w:val="center"/>
+          </w:tcPr>
+          <w:p>
+            <w:pPr>
+              <w:keepNext w:val="0"/>
+              <w:jc w:val="center"/>
+            </w:pPr>
+            <w:r>
+              <w:rPr>
+                <w:b w:val="0"/>
+                <w:sz w:val="18"/>
+              </w:rPr>
+              <w:t>8</w:t>
             </w:r>
           </w:p>
         </w:tc>
@@ -2544,7 +3223,7 @@
                 <w:b w:val="0"/>
                 <w:sz w:val="18"/>
               </w:rPr>
-              <w:t>6</w:t>
+              <w:t>9</w:t>
             </w:r>
           </w:p>
         </w:tc>
@@ -2641,7 +3320,7 @@
                 <w:b w:val="0"/>
                 <w:sz w:val="18"/>
               </w:rPr>
-              <w:t>7</w:t>
+              <w:t>10</w:t>
             </w:r>
           </w:p>
         </w:tc>
@@ -2659,7 +3338,7 @@
                 <w:b w:val="0"/>
                 <w:sz w:val="18"/>
               </w:rPr>
-              <w:t>Namecoin, Litecoin, Primecoin and Zcash</w:t>
+              <w:t>Namecoin and Litecoin</w:t>
             </w:r>
           </w:p>
         </w:tc>
@@ -2678,7 +3357,7 @@
                 <w:b w:val="0"/>
                 <w:sz w:val="18"/>
               </w:rPr>
-              <w:t>2</w:t>
+              <w:t>1</w:t>
             </w:r>
           </w:p>
         </w:tc>
@@ -2714,7 +3393,7 @@
                 <w:b w:val="0"/>
                 <w:sz w:val="18"/>
               </w:rPr>
-              <w:t>Compare altcoins by purpose and consensus; quiz on Unit III</w:t>
+              <w:t>Compare with Bitcoin by purpose and consensus</w:t>
             </w:r>
           </w:p>
         </w:tc>
@@ -2738,7 +3417,104 @@
                 <w:b w:val="0"/>
                 <w:sz w:val="18"/>
               </w:rPr>
-              <w:t>8</w:t>
+              <w:t>11</w:t>
+            </w:r>
+          </w:p>
+        </w:tc>
+        <w:tc>
+          <w:tcPr>
+            <w:tcW w:type="dxa" w:w="4139"/>
+            <w:vAlign w:val="center"/>
+          </w:tcPr>
+          <w:p>
+            <w:pPr>
+              <w:keepNext w:val="0"/>
+            </w:pPr>
+            <w:r>
+              <w:rPr>
+                <w:b w:val="0"/>
+                <w:sz w:val="18"/>
+              </w:rPr>
+              <w:t>Primecoin and Zcash</w:t>
+            </w:r>
+          </w:p>
+        </w:tc>
+        <w:tc>
+          <w:tcPr>
+            <w:tcW w:type="dxa" w:w="624"/>
+            <w:vAlign w:val="center"/>
+          </w:tcPr>
+          <w:p>
+            <w:pPr>
+              <w:keepNext w:val="0"/>
+              <w:jc w:val="center"/>
+            </w:pPr>
+            <w:r>
+              <w:rPr>
+                <w:b w:val="0"/>
+                <w:sz w:val="18"/>
+              </w:rPr>
+              <w:t>1</w:t>
+            </w:r>
+          </w:p>
+        </w:tc>
+        <w:tc>
+          <w:tcPr>
+            <w:tcW w:type="dxa" w:w="1984"/>
+            <w:vAlign w:val="center"/>
+          </w:tcPr>
+          <w:p>
+            <w:pPr>
+              <w:keepNext w:val="0"/>
+            </w:pPr>
+            <w:r>
+              <w:rPr>
+                <w:b w:val="0"/>
+                <w:sz w:val="18"/>
+              </w:rPr>
+              <w:t>Lecture / Case Study</w:t>
+            </w:r>
+          </w:p>
+        </w:tc>
+        <w:tc>
+          <w:tcPr>
+            <w:tcW w:type="dxa" w:w="3118"/>
+            <w:vAlign w:val="center"/>
+          </w:tcPr>
+          <w:p>
+            <w:pPr>
+              <w:keepNext w:val="0"/>
+            </w:pPr>
+            <w:r>
+              <w:rPr>
+                <w:b w:val="0"/>
+                <w:sz w:val="18"/>
+              </w:rPr>
+              <w:t>Study proof-of-work on primes and zero-knowledge proofs</w:t>
+            </w:r>
+          </w:p>
+        </w:tc>
+      </w:tr>
+      <w:tr>
+        <w:trPr>
+          <w:cantSplit w:val="true"/>
+        </w:trPr>
+        <w:tc>
+          <w:tcPr>
+            <w:tcW w:type="dxa" w:w="680"/>
+            <w:vAlign w:val="center"/>
+          </w:tcPr>
+          <w:p>
+            <w:pPr>
+              <w:keepNext w:val="0"/>
+              <w:jc w:val="center"/>
+            </w:pPr>
+            <w:r>
+              <w:rPr>
+                <w:b w:val="0"/>
+                <w:sz w:val="18"/>
+              </w:rPr>
+              <w:t>12</w:t>
             </w:r>
           </w:p>
         </w:tc>
@@ -2793,7 +3569,7 @@
                 <w:b w:val="0"/>
                 <w:sz w:val="18"/>
               </w:rPr>
-              <w:t>Demonstration</w:t>
+              <w:t>Demonstration / Quiz</w:t>
             </w:r>
           </w:p>
         </w:tc>
@@ -2811,7 +3587,7 @@
                 <w:b w:val="0"/>
                 <w:sz w:val="18"/>
               </w:rPr>
-              <w:t>Outline the design of a custom token</w:t>
+              <w:t>Outline the design of a custom token; quiz on Unit III</w:t>
             </w:r>
           </w:p>
         </w:tc>
@@ -2828,7 +3604,7 @@
           <w:sz w:val="23"/>
           <w:u w:val="none"/>
         </w:rPr>
-        <w:t>UNIT IV: Ethereum and Smart Contracts — 9 Hours</w:t>
+        <w:t>UNIT IV: Ethereum and Smart Contracts — 13 Hours</w:t>
       </w:r>
     </w:p>
     <w:tbl>
@@ -2990,7 +3766,7 @@
                 <w:b w:val="0"/>
                 <w:sz w:val="18"/>
               </w:rPr>
-              <w:t>Ethereum Architecture – accounts, EVM, gas, transactions, blocks, networks</w:t>
+              <w:t>Ethereum Architecture – EVM, accounts, transactions</w:t>
             </w:r>
           </w:p>
         </w:tc>
@@ -3045,7 +3821,7 @@
                 <w:b w:val="0"/>
                 <w:sz w:val="18"/>
               </w:rPr>
-              <w:t>Explore accounts and gas on a test network</w:t>
+              <w:t>Explore accounts and transactions on a test network</w:t>
             </w:r>
           </w:p>
         </w:tc>
@@ -3087,7 +3863,104 @@
                 <w:b w:val="0"/>
                 <w:sz w:val="18"/>
               </w:rPr>
-              <w:t>Solidity programming basics – data types, variables, functions, modifiers, events</w:t>
+              <w:t>Ethereum gas, blocks, networks and clients</w:t>
+            </w:r>
+          </w:p>
+        </w:tc>
+        <w:tc>
+          <w:tcPr>
+            <w:tcW w:type="dxa" w:w="624"/>
+            <w:vAlign w:val="center"/>
+          </w:tcPr>
+          <w:p>
+            <w:pPr>
+              <w:keepNext w:val="0"/>
+              <w:jc w:val="center"/>
+            </w:pPr>
+            <w:r>
+              <w:rPr>
+                <w:b w:val="0"/>
+                <w:sz w:val="18"/>
+              </w:rPr>
+              <w:t>1</w:t>
+            </w:r>
+          </w:p>
+        </w:tc>
+        <w:tc>
+          <w:tcPr>
+            <w:tcW w:type="dxa" w:w="1984"/>
+            <w:vAlign w:val="center"/>
+          </w:tcPr>
+          <w:p>
+            <w:pPr>
+              <w:keepNext w:val="0"/>
+            </w:pPr>
+            <w:r>
+              <w:rPr>
+                <w:b w:val="0"/>
+                <w:sz w:val="18"/>
+              </w:rPr>
+              <w:t>Lecture / Demonstration</w:t>
+            </w:r>
+          </w:p>
+        </w:tc>
+        <w:tc>
+          <w:tcPr>
+            <w:tcW w:type="dxa" w:w="3118"/>
+            <w:vAlign w:val="center"/>
+          </w:tcPr>
+          <w:p>
+            <w:pPr>
+              <w:keepNext w:val="0"/>
+            </w:pPr>
+            <w:r>
+              <w:rPr>
+                <w:b w:val="0"/>
+                <w:sz w:val="18"/>
+              </w:rPr>
+              <w:t>Estimate gas costs for sample transactions</w:t>
+            </w:r>
+          </w:p>
+        </w:tc>
+      </w:tr>
+      <w:tr>
+        <w:trPr>
+          <w:cantSplit w:val="true"/>
+        </w:trPr>
+        <w:tc>
+          <w:tcPr>
+            <w:tcW w:type="dxa" w:w="680"/>
+            <w:vAlign w:val="center"/>
+          </w:tcPr>
+          <w:p>
+            <w:pPr>
+              <w:keepNext w:val="0"/>
+              <w:jc w:val="center"/>
+            </w:pPr>
+            <w:r>
+              <w:rPr>
+                <w:b w:val="0"/>
+                <w:sz w:val="18"/>
+              </w:rPr>
+              <w:t>3</w:t>
+            </w:r>
+          </w:p>
+        </w:tc>
+        <w:tc>
+          <w:tcPr>
+            <w:tcW w:type="dxa" w:w="4139"/>
+            <w:vAlign w:val="center"/>
+          </w:tcPr>
+          <w:p>
+            <w:pPr>
+              <w:keepNext w:val="0"/>
+            </w:pPr>
+            <w:r>
+              <w:rPr>
+                <w:b w:val="0"/>
+                <w:sz w:val="18"/>
+              </w:rPr>
+              <w:t>Solidity programming basics – data types, variables, functions, control structures</w:t>
             </w:r>
           </w:p>
         </w:tc>
@@ -3166,7 +4039,7 @@
                 <w:b w:val="0"/>
                 <w:sz w:val="18"/>
               </w:rPr>
-              <w:t>3</w:t>
+              <w:t>4</w:t>
             </w:r>
           </w:p>
         </w:tc>
@@ -3184,7 +4057,7 @@
                 <w:b w:val="0"/>
                 <w:sz w:val="18"/>
               </w:rPr>
-              <w:t>Smart Contract – structure, life cycle, security issues</w:t>
+              <w:t>Solidity – mappings, structs, modifiers, events, inheritance</w:t>
             </w:r>
           </w:p>
         </w:tc>
@@ -3204,6 +4077,103 @@
                 <w:sz w:val="18"/>
               </w:rPr>
               <w:t>1</w:t>
+            </w:r>
+          </w:p>
+        </w:tc>
+        <w:tc>
+          <w:tcPr>
+            <w:tcW w:type="dxa" w:w="1984"/>
+            <w:vAlign w:val="center"/>
+          </w:tcPr>
+          <w:p>
+            <w:pPr>
+              <w:keepNext w:val="0"/>
+            </w:pPr>
+            <w:r>
+              <w:rPr>
+                <w:b w:val="0"/>
+                <w:sz w:val="18"/>
+              </w:rPr>
+              <w:t>Demonstration / Hands-on</w:t>
+            </w:r>
+          </w:p>
+        </w:tc>
+        <w:tc>
+          <w:tcPr>
+            <w:tcW w:type="dxa" w:w="3118"/>
+            <w:vAlign w:val="center"/>
+          </w:tcPr>
+          <w:p>
+            <w:pPr>
+              <w:keepNext w:val="0"/>
+            </w:pPr>
+            <w:r>
+              <w:rPr>
+                <w:b w:val="0"/>
+                <w:sz w:val="18"/>
+              </w:rPr>
+              <w:t>Extend programs with modifiers and events</w:t>
+            </w:r>
+          </w:p>
+        </w:tc>
+      </w:tr>
+      <w:tr>
+        <w:trPr>
+          <w:cantSplit w:val="true"/>
+        </w:trPr>
+        <w:tc>
+          <w:tcPr>
+            <w:tcW w:type="dxa" w:w="680"/>
+            <w:vAlign w:val="center"/>
+          </w:tcPr>
+          <w:p>
+            <w:pPr>
+              <w:keepNext w:val="0"/>
+              <w:jc w:val="center"/>
+            </w:pPr>
+            <w:r>
+              <w:rPr>
+                <w:b w:val="0"/>
+                <w:sz w:val="18"/>
+              </w:rPr>
+              <w:t>5</w:t>
+            </w:r>
+          </w:p>
+        </w:tc>
+        <w:tc>
+          <w:tcPr>
+            <w:tcW w:type="dxa" w:w="4139"/>
+            <w:vAlign w:val="center"/>
+          </w:tcPr>
+          <w:p>
+            <w:pPr>
+              <w:keepNext w:val="0"/>
+            </w:pPr>
+            <w:r>
+              <w:rPr>
+                <w:b w:val="0"/>
+                <w:sz w:val="18"/>
+              </w:rPr>
+              <w:t>Smart Contract – structure, life cycle, common security issues</w:t>
+            </w:r>
+          </w:p>
+        </w:tc>
+        <w:tc>
+          <w:tcPr>
+            <w:tcW w:type="dxa" w:w="624"/>
+            <w:vAlign w:val="center"/>
+          </w:tcPr>
+          <w:p>
+            <w:pPr>
+              <w:keepNext w:val="0"/>
+              <w:jc w:val="center"/>
+            </w:pPr>
+            <w:r>
+              <w:rPr>
+                <w:b w:val="0"/>
+                <w:sz w:val="18"/>
+              </w:rPr>
+              <w:t>2</w:t>
             </w:r>
           </w:p>
         </w:tc>
@@ -3263,7 +4233,7 @@
                 <w:b w:val="0"/>
                 <w:sz w:val="18"/>
               </w:rPr>
-              <w:t>4</w:t>
+              <w:t>6</w:t>
             </w:r>
           </w:p>
         </w:tc>
@@ -3281,7 +4251,7 @@
                 <w:b w:val="0"/>
                 <w:sz w:val="18"/>
               </w:rPr>
-              <w:t>Deploying Smart Contracts – Remix, MetaMask, test networks, Ganache / Truffle</w:t>
+              <w:t>Deploying Smart Contracts – Remix, MetaMask and test networks</w:t>
             </w:r>
           </w:p>
         </w:tc>
@@ -3360,7 +4330,104 @@
                 <w:b w:val="0"/>
                 <w:sz w:val="18"/>
               </w:rPr>
-              <w:t>5</w:t>
+              <w:t>7</w:t>
+            </w:r>
+          </w:p>
+        </w:tc>
+        <w:tc>
+          <w:tcPr>
+            <w:tcW w:type="dxa" w:w="4139"/>
+            <w:vAlign w:val="center"/>
+          </w:tcPr>
+          <w:p>
+            <w:pPr>
+              <w:keepNext w:val="0"/>
+            </w:pPr>
+            <w:r>
+              <w:rPr>
+                <w:b w:val="0"/>
+                <w:sz w:val="18"/>
+              </w:rPr>
+              <w:t>Deploying Smart Contracts with Ganache and Truffle</w:t>
+            </w:r>
+          </w:p>
+        </w:tc>
+        <w:tc>
+          <w:tcPr>
+            <w:tcW w:type="dxa" w:w="624"/>
+            <w:vAlign w:val="center"/>
+          </w:tcPr>
+          <w:p>
+            <w:pPr>
+              <w:keepNext w:val="0"/>
+              <w:jc w:val="center"/>
+            </w:pPr>
+            <w:r>
+              <w:rPr>
+                <w:b w:val="0"/>
+                <w:sz w:val="18"/>
+              </w:rPr>
+              <w:t>1</w:t>
+            </w:r>
+          </w:p>
+        </w:tc>
+        <w:tc>
+          <w:tcPr>
+            <w:tcW w:type="dxa" w:w="1984"/>
+            <w:vAlign w:val="center"/>
+          </w:tcPr>
+          <w:p>
+            <w:pPr>
+              <w:keepNext w:val="0"/>
+            </w:pPr>
+            <w:r>
+              <w:rPr>
+                <w:b w:val="0"/>
+                <w:sz w:val="18"/>
+              </w:rPr>
+              <w:t>Demonstration / Hands-on</w:t>
+            </w:r>
+          </w:p>
+        </w:tc>
+        <w:tc>
+          <w:tcPr>
+            <w:tcW w:type="dxa" w:w="3118"/>
+            <w:vAlign w:val="center"/>
+          </w:tcPr>
+          <w:p>
+            <w:pPr>
+              <w:keepNext w:val="0"/>
+            </w:pPr>
+            <w:r>
+              <w:rPr>
+                <w:b w:val="0"/>
+                <w:sz w:val="18"/>
+              </w:rPr>
+              <w:t>Deploy and test a contract on a local blockchain</w:t>
+            </w:r>
+          </w:p>
+        </w:tc>
+      </w:tr>
+      <w:tr>
+        <w:trPr>
+          <w:cantSplit w:val="true"/>
+        </w:trPr>
+        <w:tc>
+          <w:tcPr>
+            <w:tcW w:type="dxa" w:w="680"/>
+            <w:vAlign w:val="center"/>
+          </w:tcPr>
+          <w:p>
+            <w:pPr>
+              <w:keepNext w:val="0"/>
+              <w:jc w:val="center"/>
+            </w:pPr>
+            <w:r>
+              <w:rPr>
+                <w:b w:val="0"/>
+                <w:sz w:val="18"/>
+              </w:rPr>
+              <w:t>8</w:t>
             </w:r>
           </w:p>
         </w:tc>
@@ -3450,7 +4517,7 @@
           <w:sz w:val="23"/>
           <w:u w:val="none"/>
         </w:rPr>
-        <w:t>UNIT V: Blockchain Applications — 5 Hours</w:t>
+        <w:t>UNIT V: Blockchain Applications — 8 Hours</w:t>
       </w:r>
     </w:p>
     <w:tbl>
@@ -3709,7 +4776,7 @@
                 <w:b w:val="0"/>
                 <w:sz w:val="18"/>
               </w:rPr>
-              <w:t>Government and Health</w:t>
+              <w:t>Government</w:t>
             </w:r>
           </w:p>
         </w:tc>
@@ -3764,7 +4831,7 @@
                 <w:b w:val="0"/>
                 <w:sz w:val="18"/>
               </w:rPr>
-              <w:t>Discuss e-governance, land and health records</w:t>
+              <w:t>Discuss e-governance and land records</w:t>
             </w:r>
           </w:p>
         </w:tc>
@@ -3789,6 +4856,103 @@
                 <w:sz w:val="18"/>
               </w:rPr>
               <w:t>3</w:t>
+            </w:r>
+          </w:p>
+        </w:tc>
+        <w:tc>
+          <w:tcPr>
+            <w:tcW w:type="dxa" w:w="4139"/>
+            <w:vAlign w:val="center"/>
+          </w:tcPr>
+          <w:p>
+            <w:pPr>
+              <w:keepNext w:val="0"/>
+            </w:pPr>
+            <w:r>
+              <w:rPr>
+                <w:b w:val="0"/>
+                <w:sz w:val="18"/>
+              </w:rPr>
+              <w:t>Health</w:t>
+            </w:r>
+          </w:p>
+        </w:tc>
+        <w:tc>
+          <w:tcPr>
+            <w:tcW w:type="dxa" w:w="624"/>
+            <w:vAlign w:val="center"/>
+          </w:tcPr>
+          <w:p>
+            <w:pPr>
+              <w:keepNext w:val="0"/>
+              <w:jc w:val="center"/>
+            </w:pPr>
+            <w:r>
+              <w:rPr>
+                <w:b w:val="0"/>
+                <w:sz w:val="18"/>
+              </w:rPr>
+              <w:t>1</w:t>
+            </w:r>
+          </w:p>
+        </w:tc>
+        <w:tc>
+          <w:tcPr>
+            <w:tcW w:type="dxa" w:w="1984"/>
+            <w:vAlign w:val="center"/>
+          </w:tcPr>
+          <w:p>
+            <w:pPr>
+              <w:keepNext w:val="0"/>
+            </w:pPr>
+            <w:r>
+              <w:rPr>
+                <w:b w:val="0"/>
+                <w:sz w:val="18"/>
+              </w:rPr>
+              <w:t>Lecture / Case Study</w:t>
+            </w:r>
+          </w:p>
+        </w:tc>
+        <w:tc>
+          <w:tcPr>
+            <w:tcW w:type="dxa" w:w="3118"/>
+            <w:vAlign w:val="center"/>
+          </w:tcPr>
+          <w:p>
+            <w:pPr>
+              <w:keepNext w:val="0"/>
+            </w:pPr>
+            <w:r>
+              <w:rPr>
+                <w:b w:val="0"/>
+                <w:sz w:val="18"/>
+              </w:rPr>
+              <w:t>Study sharing of electronic health records</w:t>
+            </w:r>
+          </w:p>
+        </w:tc>
+      </w:tr>
+      <w:tr>
+        <w:trPr>
+          <w:cantSplit w:val="true"/>
+        </w:trPr>
+        <w:tc>
+          <w:tcPr>
+            <w:tcW w:type="dxa" w:w="680"/>
+            <w:vAlign w:val="center"/>
+          </w:tcPr>
+          <w:p>
+            <w:pPr>
+              <w:keepNext w:val="0"/>
+              <w:jc w:val="center"/>
+            </w:pPr>
+            <w:r>
+              <w:rPr>
+                <w:b w:val="0"/>
+                <w:sz w:val="18"/>
+              </w:rPr>
+              <w:t>4</w:t>
             </w:r>
           </w:p>
         </w:tc>
@@ -3885,7 +5049,7 @@
                 <w:b w:val="0"/>
                 <w:sz w:val="18"/>
               </w:rPr>
-              <w:t>4</w:t>
+              <w:t>5</w:t>
             </w:r>
           </w:p>
         </w:tc>
@@ -3903,7 +5067,104 @@
                 <w:b w:val="0"/>
                 <w:sz w:val="18"/>
               </w:rPr>
-              <w:t>Media; Secure Voting and Digital Identity</w:t>
+              <w:t>Media</w:t>
+            </w:r>
+          </w:p>
+        </w:tc>
+        <w:tc>
+          <w:tcPr>
+            <w:tcW w:type="dxa" w:w="624"/>
+            <w:vAlign w:val="center"/>
+          </w:tcPr>
+          <w:p>
+            <w:pPr>
+              <w:keepNext w:val="0"/>
+              <w:jc w:val="center"/>
+            </w:pPr>
+            <w:r>
+              <w:rPr>
+                <w:b w:val="0"/>
+                <w:sz w:val="18"/>
+              </w:rPr>
+              <w:t>1</w:t>
+            </w:r>
+          </w:p>
+        </w:tc>
+        <w:tc>
+          <w:tcPr>
+            <w:tcW w:type="dxa" w:w="1984"/>
+            <w:vAlign w:val="center"/>
+          </w:tcPr>
+          <w:p>
+            <w:pPr>
+              <w:keepNext w:val="0"/>
+            </w:pPr>
+            <w:r>
+              <w:rPr>
+                <w:b w:val="0"/>
+                <w:sz w:val="18"/>
+              </w:rPr>
+              <w:t>Lecture / Discussion</w:t>
+            </w:r>
+          </w:p>
+        </w:tc>
+        <w:tc>
+          <w:tcPr>
+            <w:tcW w:type="dxa" w:w="3118"/>
+            <w:vAlign w:val="center"/>
+          </w:tcPr>
+          <w:p>
+            <w:pPr>
+              <w:keepNext w:val="0"/>
+            </w:pPr>
+            <w:r>
+              <w:rPr>
+                <w:b w:val="0"/>
+                <w:sz w:val="18"/>
+              </w:rPr>
+              <w:t>Discuss content ownership and royalties</w:t>
+            </w:r>
+          </w:p>
+        </w:tc>
+      </w:tr>
+      <w:tr>
+        <w:trPr>
+          <w:cantSplit w:val="true"/>
+        </w:trPr>
+        <w:tc>
+          <w:tcPr>
+            <w:tcW w:type="dxa" w:w="680"/>
+            <w:vAlign w:val="center"/>
+          </w:tcPr>
+          <w:p>
+            <w:pPr>
+              <w:keepNext w:val="0"/>
+              <w:jc w:val="center"/>
+            </w:pPr>
+            <w:r>
+              <w:rPr>
+                <w:b w:val="0"/>
+                <w:sz w:val="18"/>
+              </w:rPr>
+              <w:t>6</w:t>
+            </w:r>
+          </w:p>
+        </w:tc>
+        <w:tc>
+          <w:tcPr>
+            <w:tcW w:type="dxa" w:w="4139"/>
+            <w:vAlign w:val="center"/>
+          </w:tcPr>
+          <w:p>
+            <w:pPr>
+              <w:keepNext w:val="0"/>
+            </w:pPr>
+            <w:r>
+              <w:rPr>
+                <w:b w:val="0"/>
+                <w:sz w:val="18"/>
+              </w:rPr>
+              <w:t>Secure Voting and Digital Identity</w:t>
             </w:r>
           </w:p>
         </w:tc>
@@ -3982,7 +5243,7 @@
                 <w:b w:val="0"/>
                 <w:sz w:val="18"/>
               </w:rPr>
-              <w:t>5</w:t>
+              <w:t>7</w:t>
             </w:r>
           </w:p>
         </w:tc>
@@ -4000,7 +5261,7 @@
                 <w:b w:val="0"/>
                 <w:sz w:val="18"/>
               </w:rPr>
-              <w:t>Real Estate and Education</w:t>
+              <w:t>Real Estate</w:t>
             </w:r>
           </w:p>
         </w:tc>
@@ -4055,7 +5316,104 @@
                 <w:b w:val="0"/>
                 <w:sz w:val="18"/>
               </w:rPr>
-              <w:t>Study land records and certificate verification; quiz on Unit V</w:t>
+              <w:t>Study property registration and tokenisation</w:t>
+            </w:r>
+          </w:p>
+        </w:tc>
+      </w:tr>
+      <w:tr>
+        <w:trPr>
+          <w:cantSplit w:val="true"/>
+        </w:trPr>
+        <w:tc>
+          <w:tcPr>
+            <w:tcW w:type="dxa" w:w="680"/>
+            <w:vAlign w:val="center"/>
+          </w:tcPr>
+          <w:p>
+            <w:pPr>
+              <w:keepNext w:val="0"/>
+              <w:jc w:val="center"/>
+            </w:pPr>
+            <w:r>
+              <w:rPr>
+                <w:b w:val="0"/>
+                <w:sz w:val="18"/>
+              </w:rPr>
+              <w:t>8</w:t>
+            </w:r>
+          </w:p>
+        </w:tc>
+        <w:tc>
+          <w:tcPr>
+            <w:tcW w:type="dxa" w:w="4139"/>
+            <w:vAlign w:val="center"/>
+          </w:tcPr>
+          <w:p>
+            <w:pPr>
+              <w:keepNext w:val="0"/>
+            </w:pPr>
+            <w:r>
+              <w:rPr>
+                <w:b w:val="0"/>
+                <w:sz w:val="18"/>
+              </w:rPr>
+              <w:t>Education</w:t>
+            </w:r>
+          </w:p>
+        </w:tc>
+        <w:tc>
+          <w:tcPr>
+            <w:tcW w:type="dxa" w:w="624"/>
+            <w:vAlign w:val="center"/>
+          </w:tcPr>
+          <w:p>
+            <w:pPr>
+              <w:keepNext w:val="0"/>
+              <w:jc w:val="center"/>
+            </w:pPr>
+            <w:r>
+              <w:rPr>
+                <w:b w:val="0"/>
+                <w:sz w:val="18"/>
+              </w:rPr>
+              <w:t>1</w:t>
+            </w:r>
+          </w:p>
+        </w:tc>
+        <w:tc>
+          <w:tcPr>
+            <w:tcW w:type="dxa" w:w="1984"/>
+            <w:vAlign w:val="center"/>
+          </w:tcPr>
+          <w:p>
+            <w:pPr>
+              <w:keepNext w:val="0"/>
+            </w:pPr>
+            <w:r>
+              <w:rPr>
+                <w:b w:val="0"/>
+                <w:sz w:val="18"/>
+              </w:rPr>
+              <w:t>Lecture / Case Study</w:t>
+            </w:r>
+          </w:p>
+        </w:tc>
+        <w:tc>
+          <w:tcPr>
+            <w:tcW w:type="dxa" w:w="3118"/>
+            <w:vAlign w:val="center"/>
+          </w:tcPr>
+          <w:p>
+            <w:pPr>
+              <w:keepNext w:val="0"/>
+            </w:pPr>
+            <w:r>
+              <w:rPr>
+                <w:b w:val="0"/>
+                <w:sz w:val="18"/>
+              </w:rPr>
+              <w:t>Study certificate verification; quiz on Unit V</w:t>
             </w:r>
           </w:p>
         </w:tc>
@@ -4617,7 +5975,7 @@
           </w:tcPr>
           <w:p>
             <w:pPr>
-              <w:keepNext w:val="0"/>
+              <w:keepNext/>
               <w:jc w:val="center"/>
             </w:pPr>
             <w:r>
@@ -4636,7 +5994,7 @@
           </w:tcPr>
           <w:p>
             <w:pPr>
-              <w:keepNext w:val="0"/>
+              <w:keepNext/>
             </w:pPr>
             <w:r>
               <w:rPr>
@@ -4654,7 +6012,327 @@
           </w:tcPr>
           <w:p>
             <w:pPr>
-              <w:keepNext w:val="0"/>
+              <w:keepNext/>
+              <w:jc w:val="center"/>
+            </w:pPr>
+            <w:r>
+              <w:rPr>
+                <w:b w:val="0"/>
+                <w:sz w:val="18"/>
+              </w:rPr>
+              <w:t>10</w:t>
+            </w:r>
+          </w:p>
+        </w:tc>
+        <w:tc>
+          <w:tcPr>
+            <w:tcW w:type="dxa" w:w="1701"/>
+            <w:vAlign w:val="center"/>
+          </w:tcPr>
+          <w:p>
+            <w:pPr>
+              <w:keepNext/>
+              <w:jc w:val="center"/>
+            </w:pPr>
+            <w:r>
+              <w:rPr>
+                <w:b w:val="0"/>
+                <w:sz w:val="18"/>
+              </w:rPr>
+              <w:t>16.67%</w:t>
+            </w:r>
+          </w:p>
+        </w:tc>
+      </w:tr>
+      <w:tr>
+        <w:trPr>
+          <w:cantSplit w:val="true"/>
+        </w:trPr>
+        <w:tc>
+          <w:tcPr>
+            <w:tcW w:type="dxa" w:w="907"/>
+            <w:vAlign w:val="center"/>
+          </w:tcPr>
+          <w:p>
+            <w:pPr>
+              <w:keepNext/>
+              <w:jc w:val="center"/>
+            </w:pPr>
+            <w:r>
+              <w:rPr>
+                <w:b w:val="0"/>
+                <w:sz w:val="18"/>
+              </w:rPr>
+              <w:t>II</w:t>
+            </w:r>
+          </w:p>
+        </w:tc>
+        <w:tc>
+          <w:tcPr>
+            <w:tcW w:type="dxa" w:w="6236"/>
+            <w:vAlign w:val="center"/>
+          </w:tcPr>
+          <w:p>
+            <w:pPr>
+              <w:keepNext/>
+            </w:pPr>
+            <w:r>
+              <w:rPr>
+                <w:b w:val="0"/>
+                <w:sz w:val="18"/>
+              </w:rPr>
+              <w:t>Decentralization and Consensus Algorithms</w:t>
+            </w:r>
+          </w:p>
+        </w:tc>
+        <w:tc>
+          <w:tcPr>
+            <w:tcW w:type="dxa" w:w="1701"/>
+            <w:vAlign w:val="center"/>
+          </w:tcPr>
+          <w:p>
+            <w:pPr>
+              <w:keepNext/>
+              <w:jc w:val="center"/>
+            </w:pPr>
+            <w:r>
+              <w:rPr>
+                <w:b w:val="0"/>
+                <w:sz w:val="18"/>
+              </w:rPr>
+              <w:t>13</w:t>
+            </w:r>
+          </w:p>
+        </w:tc>
+        <w:tc>
+          <w:tcPr>
+            <w:tcW w:type="dxa" w:w="1701"/>
+            <w:vAlign w:val="center"/>
+          </w:tcPr>
+          <w:p>
+            <w:pPr>
+              <w:keepNext/>
+              <w:jc w:val="center"/>
+            </w:pPr>
+            <w:r>
+              <w:rPr>
+                <w:b w:val="0"/>
+                <w:sz w:val="18"/>
+              </w:rPr>
+              <w:t>21.67%</w:t>
+            </w:r>
+          </w:p>
+        </w:tc>
+      </w:tr>
+      <w:tr>
+        <w:trPr>
+          <w:cantSplit w:val="true"/>
+        </w:trPr>
+        <w:tc>
+          <w:tcPr>
+            <w:tcW w:type="dxa" w:w="907"/>
+            <w:vAlign w:val="center"/>
+          </w:tcPr>
+          <w:p>
+            <w:pPr>
+              <w:keepNext/>
+              <w:jc w:val="center"/>
+            </w:pPr>
+            <w:r>
+              <w:rPr>
+                <w:b w:val="0"/>
+                <w:sz w:val="18"/>
+              </w:rPr>
+              <w:t>III</w:t>
+            </w:r>
+          </w:p>
+        </w:tc>
+        <w:tc>
+          <w:tcPr>
+            <w:tcW w:type="dxa" w:w="6236"/>
+            <w:vAlign w:val="center"/>
+          </w:tcPr>
+          <w:p>
+            <w:pPr>
+              <w:keepNext/>
+            </w:pPr>
+            <w:r>
+              <w:rPr>
+                <w:b w:val="0"/>
+                <w:sz w:val="18"/>
+              </w:rPr>
+              <w:t>Bitcoin and Alternative Coins</w:t>
+            </w:r>
+          </w:p>
+        </w:tc>
+        <w:tc>
+          <w:tcPr>
+            <w:tcW w:type="dxa" w:w="1701"/>
+            <w:vAlign w:val="center"/>
+          </w:tcPr>
+          <w:p>
+            <w:pPr>
+              <w:keepNext/>
+              <w:jc w:val="center"/>
+            </w:pPr>
+            <w:r>
+              <w:rPr>
+                <w:b w:val="0"/>
+                <w:sz w:val="18"/>
+              </w:rPr>
+              <w:t>13</w:t>
+            </w:r>
+          </w:p>
+        </w:tc>
+        <w:tc>
+          <w:tcPr>
+            <w:tcW w:type="dxa" w:w="1701"/>
+            <w:vAlign w:val="center"/>
+          </w:tcPr>
+          <w:p>
+            <w:pPr>
+              <w:keepNext/>
+              <w:jc w:val="center"/>
+            </w:pPr>
+            <w:r>
+              <w:rPr>
+                <w:b w:val="0"/>
+                <w:sz w:val="18"/>
+              </w:rPr>
+              <w:t>21.67%</w:t>
+            </w:r>
+          </w:p>
+        </w:tc>
+      </w:tr>
+      <w:tr>
+        <w:trPr>
+          <w:cantSplit w:val="true"/>
+        </w:trPr>
+        <w:tc>
+          <w:tcPr>
+            <w:tcW w:type="dxa" w:w="907"/>
+            <w:vAlign w:val="center"/>
+          </w:tcPr>
+          <w:p>
+            <w:pPr>
+              <w:keepNext/>
+              <w:jc w:val="center"/>
+            </w:pPr>
+            <w:r>
+              <w:rPr>
+                <w:b w:val="0"/>
+                <w:sz w:val="18"/>
+              </w:rPr>
+              <w:t>IV</w:t>
+            </w:r>
+          </w:p>
+        </w:tc>
+        <w:tc>
+          <w:tcPr>
+            <w:tcW w:type="dxa" w:w="6236"/>
+            <w:vAlign w:val="center"/>
+          </w:tcPr>
+          <w:p>
+            <w:pPr>
+              <w:keepNext/>
+            </w:pPr>
+            <w:r>
+              <w:rPr>
+                <w:b w:val="0"/>
+                <w:sz w:val="18"/>
+              </w:rPr>
+              <w:t>Ethereum and Smart Contracts</w:t>
+            </w:r>
+          </w:p>
+        </w:tc>
+        <w:tc>
+          <w:tcPr>
+            <w:tcW w:type="dxa" w:w="1701"/>
+            <w:vAlign w:val="center"/>
+          </w:tcPr>
+          <w:p>
+            <w:pPr>
+              <w:keepNext/>
+              <w:jc w:val="center"/>
+            </w:pPr>
+            <w:r>
+              <w:rPr>
+                <w:b w:val="0"/>
+                <w:sz w:val="18"/>
+              </w:rPr>
+              <w:t>13</w:t>
+            </w:r>
+          </w:p>
+        </w:tc>
+        <w:tc>
+          <w:tcPr>
+            <w:tcW w:type="dxa" w:w="1701"/>
+            <w:vAlign w:val="center"/>
+          </w:tcPr>
+          <w:p>
+            <w:pPr>
+              <w:keepNext/>
+              <w:jc w:val="center"/>
+            </w:pPr>
+            <w:r>
+              <w:rPr>
+                <w:b w:val="0"/>
+                <w:sz w:val="18"/>
+              </w:rPr>
+              <w:t>21.67%</w:t>
+            </w:r>
+          </w:p>
+        </w:tc>
+      </w:tr>
+      <w:tr>
+        <w:trPr>
+          <w:cantSplit w:val="true"/>
+        </w:trPr>
+        <w:tc>
+          <w:tcPr>
+            <w:tcW w:type="dxa" w:w="907"/>
+            <w:vAlign w:val="center"/>
+          </w:tcPr>
+          <w:p>
+            <w:pPr>
+              <w:keepNext/>
+              <w:jc w:val="center"/>
+            </w:pPr>
+            <w:r>
+              <w:rPr>
+                <w:b w:val="0"/>
+                <w:sz w:val="18"/>
+              </w:rPr>
+              <w:t>V</w:t>
+            </w:r>
+          </w:p>
+        </w:tc>
+        <w:tc>
+          <w:tcPr>
+            <w:tcW w:type="dxa" w:w="6236"/>
+            <w:vAlign w:val="center"/>
+          </w:tcPr>
+          <w:p>
+            <w:pPr>
+              <w:keepNext/>
+            </w:pPr>
+            <w:r>
+              <w:rPr>
+                <w:b w:val="0"/>
+                <w:sz w:val="18"/>
+              </w:rPr>
+              <w:t>Blockchain Applications</w:t>
+            </w:r>
+          </w:p>
+        </w:tc>
+        <w:tc>
+          <w:tcPr>
+            <w:tcW w:type="dxa" w:w="1701"/>
+            <w:vAlign w:val="center"/>
+          </w:tcPr>
+          <w:p>
+            <w:pPr>
+              <w:keepNext/>
               <w:jc w:val="center"/>
             </w:pPr>
             <w:r>
@@ -4673,7 +6351,7 @@
           </w:tcPr>
           <w:p>
             <w:pPr>
-              <w:keepNext w:val="0"/>
+              <w:keepNext/>
               <w:jc w:val="center"/>
             </w:pPr>
             <w:r>
@@ -4681,7 +6359,7 @@
                 <w:b w:val="0"/>
                 <w:sz w:val="18"/>
               </w:rPr>
-              <w:t>17.78%</w:t>
+              <w:t>13.33%</w:t>
             </w:r>
           </w:p>
         </w:tc>
@@ -4697,327 +6375,7 @@
           </w:tcPr>
           <w:p>
             <w:pPr>
-              <w:keepNext w:val="0"/>
-              <w:jc w:val="center"/>
-            </w:pPr>
-            <w:r>
-              <w:rPr>
-                <w:b w:val="0"/>
-                <w:sz w:val="18"/>
-              </w:rPr>
-              <w:t>II</w:t>
-            </w:r>
-          </w:p>
-        </w:tc>
-        <w:tc>
-          <w:tcPr>
-            <w:tcW w:type="dxa" w:w="6236"/>
-            <w:vAlign w:val="center"/>
-          </w:tcPr>
-          <w:p>
-            <w:pPr>
-              <w:keepNext w:val="0"/>
-            </w:pPr>
-            <w:r>
-              <w:rPr>
-                <w:b w:val="0"/>
-                <w:sz w:val="18"/>
-              </w:rPr>
-              <w:t>Decentralization and Consensus Algorithms</w:t>
-            </w:r>
-          </w:p>
-        </w:tc>
-        <w:tc>
-          <w:tcPr>
-            <w:tcW w:type="dxa" w:w="1701"/>
-            <w:vAlign w:val="center"/>
-          </w:tcPr>
-          <w:p>
-            <w:pPr>
-              <w:keepNext w:val="0"/>
-              <w:jc w:val="center"/>
-            </w:pPr>
-            <w:r>
-              <w:rPr>
-                <w:b w:val="0"/>
-                <w:sz w:val="18"/>
-              </w:rPr>
-              <w:t>10</w:t>
-            </w:r>
-          </w:p>
-        </w:tc>
-        <w:tc>
-          <w:tcPr>
-            <w:tcW w:type="dxa" w:w="1701"/>
-            <w:vAlign w:val="center"/>
-          </w:tcPr>
-          <w:p>
-            <w:pPr>
-              <w:keepNext w:val="0"/>
-              <w:jc w:val="center"/>
-            </w:pPr>
-            <w:r>
-              <w:rPr>
-                <w:b w:val="0"/>
-                <w:sz w:val="18"/>
-              </w:rPr>
-              <w:t>22.22%</w:t>
-            </w:r>
-          </w:p>
-        </w:tc>
-      </w:tr>
-      <w:tr>
-        <w:trPr>
-          <w:cantSplit w:val="true"/>
-        </w:trPr>
-        <w:tc>
-          <w:tcPr>
-            <w:tcW w:type="dxa" w:w="907"/>
-            <w:vAlign w:val="center"/>
-          </w:tcPr>
-          <w:p>
-            <w:pPr>
-              <w:keepNext w:val="0"/>
-              <w:jc w:val="center"/>
-            </w:pPr>
-            <w:r>
-              <w:rPr>
-                <w:b w:val="0"/>
-                <w:sz w:val="18"/>
-              </w:rPr>
-              <w:t>III</w:t>
-            </w:r>
-          </w:p>
-        </w:tc>
-        <w:tc>
-          <w:tcPr>
-            <w:tcW w:type="dxa" w:w="6236"/>
-            <w:vAlign w:val="center"/>
-          </w:tcPr>
-          <w:p>
-            <w:pPr>
-              <w:keepNext w:val="0"/>
-            </w:pPr>
-            <w:r>
-              <w:rPr>
-                <w:b w:val="0"/>
-                <w:sz w:val="18"/>
-              </w:rPr>
-              <w:t>Bitcoin and Alternative Coins</w:t>
-            </w:r>
-          </w:p>
-        </w:tc>
-        <w:tc>
-          <w:tcPr>
-            <w:tcW w:type="dxa" w:w="1701"/>
-            <w:vAlign w:val="center"/>
-          </w:tcPr>
-          <w:p>
-            <w:pPr>
-              <w:keepNext w:val="0"/>
-              <w:jc w:val="center"/>
-            </w:pPr>
-            <w:r>
-              <w:rPr>
-                <w:b w:val="0"/>
-                <w:sz w:val="18"/>
-              </w:rPr>
-              <w:t>10</w:t>
-            </w:r>
-          </w:p>
-        </w:tc>
-        <w:tc>
-          <w:tcPr>
-            <w:tcW w:type="dxa" w:w="1701"/>
-            <w:vAlign w:val="center"/>
-          </w:tcPr>
-          <w:p>
-            <w:pPr>
-              <w:keepNext w:val="0"/>
-              <w:jc w:val="center"/>
-            </w:pPr>
-            <w:r>
-              <w:rPr>
-                <w:b w:val="0"/>
-                <w:sz w:val="18"/>
-              </w:rPr>
-              <w:t>22.22%</w:t>
-            </w:r>
-          </w:p>
-        </w:tc>
-      </w:tr>
-      <w:tr>
-        <w:trPr>
-          <w:cantSplit w:val="true"/>
-        </w:trPr>
-        <w:tc>
-          <w:tcPr>
-            <w:tcW w:type="dxa" w:w="907"/>
-            <w:vAlign w:val="center"/>
-          </w:tcPr>
-          <w:p>
-            <w:pPr>
-              <w:keepNext w:val="0"/>
-              <w:jc w:val="center"/>
-            </w:pPr>
-            <w:r>
-              <w:rPr>
-                <w:b w:val="0"/>
-                <w:sz w:val="18"/>
-              </w:rPr>
-              <w:t>IV</w:t>
-            </w:r>
-          </w:p>
-        </w:tc>
-        <w:tc>
-          <w:tcPr>
-            <w:tcW w:type="dxa" w:w="6236"/>
-            <w:vAlign w:val="center"/>
-          </w:tcPr>
-          <w:p>
-            <w:pPr>
-              <w:keepNext w:val="0"/>
-            </w:pPr>
-            <w:r>
-              <w:rPr>
-                <w:b w:val="0"/>
-                <w:sz w:val="18"/>
-              </w:rPr>
-              <w:t>Ethereum and Smart Contracts</w:t>
-            </w:r>
-          </w:p>
-        </w:tc>
-        <w:tc>
-          <w:tcPr>
-            <w:tcW w:type="dxa" w:w="1701"/>
-            <w:vAlign w:val="center"/>
-          </w:tcPr>
-          <w:p>
-            <w:pPr>
-              <w:keepNext w:val="0"/>
-              <w:jc w:val="center"/>
-            </w:pPr>
-            <w:r>
-              <w:rPr>
-                <w:b w:val="0"/>
-                <w:sz w:val="18"/>
-              </w:rPr>
-              <w:t>9</w:t>
-            </w:r>
-          </w:p>
-        </w:tc>
-        <w:tc>
-          <w:tcPr>
-            <w:tcW w:type="dxa" w:w="1701"/>
-            <w:vAlign w:val="center"/>
-          </w:tcPr>
-          <w:p>
-            <w:pPr>
-              <w:keepNext w:val="0"/>
-              <w:jc w:val="center"/>
-            </w:pPr>
-            <w:r>
-              <w:rPr>
-                <w:b w:val="0"/>
-                <w:sz w:val="18"/>
-              </w:rPr>
-              <w:t>20.00%</w:t>
-            </w:r>
-          </w:p>
-        </w:tc>
-      </w:tr>
-      <w:tr>
-        <w:trPr>
-          <w:cantSplit w:val="true"/>
-        </w:trPr>
-        <w:tc>
-          <w:tcPr>
-            <w:tcW w:type="dxa" w:w="907"/>
-            <w:vAlign w:val="center"/>
-          </w:tcPr>
-          <w:p>
-            <w:pPr>
-              <w:keepNext w:val="0"/>
-              <w:jc w:val="center"/>
-            </w:pPr>
-            <w:r>
-              <w:rPr>
-                <w:b w:val="0"/>
-                <w:sz w:val="18"/>
-              </w:rPr>
-              <w:t>V</w:t>
-            </w:r>
-          </w:p>
-        </w:tc>
-        <w:tc>
-          <w:tcPr>
-            <w:tcW w:type="dxa" w:w="6236"/>
-            <w:vAlign w:val="center"/>
-          </w:tcPr>
-          <w:p>
-            <w:pPr>
-              <w:keepNext w:val="0"/>
-            </w:pPr>
-            <w:r>
-              <w:rPr>
-                <w:b w:val="0"/>
-                <w:sz w:val="18"/>
-              </w:rPr>
-              <w:t>Blockchain Applications</w:t>
-            </w:r>
-          </w:p>
-        </w:tc>
-        <w:tc>
-          <w:tcPr>
-            <w:tcW w:type="dxa" w:w="1701"/>
-            <w:vAlign w:val="center"/>
-          </w:tcPr>
-          <w:p>
-            <w:pPr>
-              <w:keepNext w:val="0"/>
-              <w:jc w:val="center"/>
-            </w:pPr>
-            <w:r>
-              <w:rPr>
-                <w:b w:val="0"/>
-                <w:sz w:val="18"/>
-              </w:rPr>
-              <w:t>5</w:t>
-            </w:r>
-          </w:p>
-        </w:tc>
-        <w:tc>
-          <w:tcPr>
-            <w:tcW w:type="dxa" w:w="1701"/>
-            <w:vAlign w:val="center"/>
-          </w:tcPr>
-          <w:p>
-            <w:pPr>
-              <w:keepNext w:val="0"/>
-              <w:jc w:val="center"/>
-            </w:pPr>
-            <w:r>
-              <w:rPr>
-                <w:b w:val="0"/>
-                <w:sz w:val="18"/>
-              </w:rPr>
-              <w:t>11.11%</w:t>
-            </w:r>
-          </w:p>
-        </w:tc>
-      </w:tr>
-      <w:tr>
-        <w:trPr>
-          <w:cantSplit w:val="true"/>
-        </w:trPr>
-        <w:tc>
-          <w:tcPr>
-            <w:tcW w:type="dxa" w:w="907"/>
-            <w:vAlign w:val="center"/>
-          </w:tcPr>
-          <w:p>
-            <w:pPr>
-              <w:keepNext w:val="0"/>
+              <w:keepNext/>
               <w:jc w:val="center"/>
             </w:pPr>
             <w:r>
@@ -5036,7 +6394,7 @@
           </w:tcPr>
           <w:p>
             <w:pPr>
-              <w:keepNext w:val="0"/>
+              <w:keepNext/>
             </w:pPr>
             <w:r>
               <w:rPr>
@@ -5054,7 +6412,7 @@
           </w:tcPr>
           <w:p>
             <w:pPr>
-              <w:keepNext w:val="0"/>
+              <w:keepNext/>
               <w:jc w:val="center"/>
             </w:pPr>
             <w:r>
@@ -5073,7 +6431,7 @@
           </w:tcPr>
           <w:p>
             <w:pPr>
-              <w:keepNext w:val="0"/>
+              <w:keepNext/>
               <w:jc w:val="center"/>
             </w:pPr>
             <w:r>
@@ -5081,7 +6439,7 @@
                 <w:b w:val="0"/>
                 <w:sz w:val="18"/>
               </w:rPr>
-              <w:t>6.67%</w:t>
+              <w:t>5.00%</w:t>
             </w:r>
           </w:p>
         </w:tc>
@@ -5141,7 +6499,7 @@
                 <w:b/>
                 <w:sz w:val="18"/>
               </w:rPr>
-              <w:t>45</w:t>
+              <w:t>60</w:t>
             </w:r>
           </w:p>
         </w:tc>

</xml_diff>